<commit_message>
Document verified Docker, Minikube and CI/CD deployment evidence
</commit_message>
<xml_diff>
--- a/SOLUTION.docx
+++ b/SOLUTION.docx
@@ -3139,7 +3139,7 @@
     </w:p>
     <w:p>
       <w:r>
-        <w:t>Each service folder is a standalone repository root. It has its own dependency manifest, tests and Dockerfile, and does not import the other service’s code. The services are published in separate GitHub repositories linked in Section 8.</w:t>
+        <w:t>Each service is maintained in a separate GitHub repository with its own dependencies, tests, Dockerfile, CI and Kubernetes manifests. CouchQuest pins both repositories as Git submodules. The ZIP expands those pinned versions for convenient offline use.</w:t>
       </w:r>
     </w:p>
     <w:p>
@@ -3165,12 +3165,12 @@
         <w:pStyle w:val="Heading2"/>
       </w:pPr>
       <w:r>
-        <w:t>Optional continuous integration</w:t>
+        <w:t>Continuous integration and deployment</w:t>
       </w:r>
     </w:p>
     <w:p>
       <w:r>
-        <w:t>Each repository includes a GitHub Actions workflow that installs dependencies, runs its tests and builds its container image. This is a CI pipeline. Publishing images and deploying to a cluster are not configured.</w:t>
+        <w:t>Each service has independent test and image-build CI. The coordinating CI/CD workflow tests both pinned versions, builds images, deploys to a temporary Minikube cluster and verifies the HTTP flow. The run passed on 30 October 2026. Section 9 records the evidence and options considered.</w:t>
       </w:r>
     </w:p>
     <w:p>
@@ -3392,12 +3392,12 @@
         <w:pStyle w:val="Heading1"/>
       </w:pPr>
       <w:r>
-        <w:t>6 Kubernetes deployment plan</w:t>
+        <w:t>6 Kubernetes deployment</w:t>
       </w:r>
     </w:p>
     <w:p>
       <w:r>
-        <w:t>Install Minikube and kubectl and start Docker. Use the dedicated couchquest profile. Full copyable commands, including database Secrets, are in README.md under Minikube deployment.</w:t>
+        <w:t>Use Docker and the dedicated couchquest Minikube profile. The commands preserve the current default Kubernetes context. Full instructions are in README.md.</w:t>
       </w:r>
     </w:p>
     <w:p>
@@ -3407,62 +3407,26 @@
       <w:r>
         <w:rPr>
           <w:rFonts w:ascii="Courier New" w:hAnsi="Courier New"/>
-          <w:sz w:val="18"/>
+          <w:sz w:val="16"/>
         </w:rPr>
         <w:t>minikube start -p couchquest --driver=docker \</w:t>
-      </w:r>
-      <w:r>
-        <w:rPr>
-          <w:rFonts w:ascii="Courier New" w:hAnsi="Courier New"/>
-          <w:sz w:val="18"/>
-        </w:rPr>
         <w:br/>
-        <w:t xml:space="preserve">  --cpus=2 --memory=4096</w:t>
-      </w:r>
-      <w:r>
-        <w:rPr>
-          <w:rFonts w:ascii="Courier New" w:hAnsi="Courier New"/>
-          <w:sz w:val="18"/>
-        </w:rPr>
+        <w:t xml:space="preserve">  --cpus=2 --memory=2800 --kubernetes-version=v1.35.0 \</w:t>
         <w:br/>
-        <w:t>kubectl config use-context couchquest</w:t>
-      </w:r>
-      <w:r>
-        <w:rPr>
-          <w:rFonts w:ascii="Courier New" w:hAnsi="Courier New"/>
-          <w:sz w:val="18"/>
-        </w:rPr>
+        <w:t xml:space="preserve">  --keep-context</w:t>
         <w:br/>
         <w:t>minikube -p couchquest image build \</w:t>
-      </w:r>
-      <w:r>
-        <w:rPr>
-          <w:rFonts w:ascii="Courier New" w:hAnsi="Courier New"/>
-          <w:sz w:val="18"/>
-        </w:rPr>
         <w:br/>
         <w:t xml:space="preserve">  -t couchquest-catalog:1.0 catalog-service</w:t>
-      </w:r>
-      <w:r>
-        <w:rPr>
-          <w:rFonts w:ascii="Courier New" w:hAnsi="Courier New"/>
-          <w:sz w:val="18"/>
-        </w:rPr>
         <w:br/>
         <w:t>minikube -p couchquest image build \</w:t>
-      </w:r>
-      <w:r>
-        <w:rPr>
-          <w:rFonts w:ascii="Courier New" w:hAnsi="Courier New"/>
-          <w:sz w:val="18"/>
-        </w:rPr>
         <w:br/>
         <w:t xml:space="preserve">  -t couchquest-session:1.0 session-service</w:t>
       </w:r>
     </w:p>
     <w:p>
       <w:r>
-        <w:t>Create the couchquest namespace and the catalog-secret and session-secret objects before applying workloads. Each Secret needs password and database-url keys. Use matching passwords for the database and connection URL. Use the exact commands in README.md; never commit real credentials.</w:t>
+        <w:t>The deployment helper creates random local database Secrets if missing, preserves existing credentials, applies workloads and waits for readiness. It always targets couchquest explicitly. Do not commit local credentials.</w:t>
       </w:r>
     </w:p>
     <w:p>
@@ -3472,49 +3436,13 @@
       <w:r>
         <w:rPr>
           <w:rFonts w:ascii="Courier New" w:hAnsi="Courier New"/>
-          <w:sz w:val="18"/>
+          <w:sz w:val="16"/>
         </w:rPr>
-        <w:t>kubectl apply -f deployment/kubernetes.yaml</w:t>
-      </w:r>
-      <w:r>
-        <w:rPr>
-          <w:rFonts w:ascii="Courier New" w:hAnsi="Courier New"/>
-          <w:sz w:val="18"/>
-        </w:rPr>
+        <w:t>python3 deployment/deploy.py</w:t>
         <w:br/>
-        <w:t>kubectl -n couchquest rollout status deployment/catalog-db</w:t>
-      </w:r>
-      <w:r>
-        <w:rPr>
-          <w:rFonts w:ascii="Courier New" w:hAnsi="Courier New"/>
-          <w:sz w:val="18"/>
-        </w:rPr>
+        <w:t>minikube -p couchquest kubectl -- --context couchquest \</w:t>
         <w:br/>
-        <w:t>kubectl -n couchquest rollout status deployment/session-db</w:t>
-      </w:r>
-      <w:r>
-        <w:rPr>
-          <w:rFonts w:ascii="Courier New" w:hAnsi="Courier New"/>
-          <w:sz w:val="18"/>
-        </w:rPr>
-        <w:br/>
-        <w:t>kubectl -n couchquest rollout status deployment/catalog</w:t>
-      </w:r>
-      <w:r>
-        <w:rPr>
-          <w:rFonts w:ascii="Courier New" w:hAnsi="Courier New"/>
-          <w:sz w:val="18"/>
-        </w:rPr>
-        <w:br/>
-        <w:t>kubectl -n couchquest rollout status deployment/session</w:t>
-      </w:r>
-      <w:r>
-        <w:rPr>
-          <w:rFonts w:ascii="Courier New" w:hAnsi="Courier New"/>
-          <w:sz w:val="18"/>
-        </w:rPr>
-        <w:br/>
-        <w:t>kubectl -n couchquest get deployments,pods,services,pvc</w:t>
+        <w:t xml:space="preserve">  -n couchquest get deployments,pods,services,pvc</w:t>
       </w:r>
     </w:p>
     <w:p>
@@ -3532,7 +3460,7 @@
     </w:p>
     <w:p>
       <w:r>
-        <w:t>Free local ports 8001 and 8002 first. Run these port forwards in separate terminals, then use Postman or the smoke test. Select couchquest in the dashboard namespace selector.</w:t>
+        <w:t>Use separate terminals for the port forwards below. Ports 18001 and 18002 avoid the Docker Compose ports. Set the smoke runner or Postman URLs to these ports. Select couchquest in the dashboard.</w:t>
       </w:r>
     </w:p>
     <w:p>
@@ -3542,23 +3470,15 @@
       <w:r>
         <w:rPr>
           <w:rFonts w:ascii="Courier New" w:hAnsi="Courier New"/>
-          <w:sz w:val="18"/>
+          <w:sz w:val="16"/>
         </w:rPr>
-        <w:t>kubectl -n couchquest port-forward service/catalog 8001:8000</w:t>
-      </w:r>
-      <w:r>
-        <w:rPr>
-          <w:rFonts w:ascii="Courier New" w:hAnsi="Courier New"/>
-          <w:sz w:val="18"/>
-        </w:rPr>
+        <w:t>minikube -p couchquest kubectl -- --context couchquest \</w:t>
         <w:br/>
-        <w:t>kubectl -n couchquest port-forward service/session 8002:8000</w:t>
-      </w:r>
-      <w:r>
-        <w:rPr>
-          <w:rFonts w:ascii="Courier New" w:hAnsi="Courier New"/>
-          <w:sz w:val="18"/>
-        </w:rPr>
+        <w:t xml:space="preserve">  -n couchquest port-forward service/catalog 18001:8000</w:t>
+        <w:br/>
+        <w:t>minikube -p couchquest kubectl -- --context couchquest \</w:t>
+        <w:br/>
+        <w:t xml:space="preserve">  -n couchquest port-forward service/session 18002:8000</w:t>
         <w:br/>
         <w:t>minikube -p couchquest dashboard</w:t>
       </w:r>
@@ -3578,49 +3498,17 @@
       <w:r>
         <w:rPr>
           <w:rFonts w:ascii="Courier New" w:hAnsi="Courier New"/>
-          <w:sz w:val="18"/>
+          <w:sz w:val="16"/>
         </w:rPr>
-        <w:t>kubectl -n couchquest scale deployment/session --replicas=2</w:t>
-      </w:r>
-      <w:r>
-        <w:rPr>
-          <w:rFonts w:ascii="Courier New" w:hAnsi="Courier New"/>
-          <w:sz w:val="18"/>
-        </w:rPr>
+        <w:t>minikube -p couchquest kubectl -- --context couchquest \</w:t>
         <w:br/>
-        <w:t>kubectl -n couchquest get pods</w:t>
-      </w:r>
-      <w:r>
-        <w:rPr>
-          <w:rFonts w:ascii="Courier New" w:hAnsi="Courier New"/>
-          <w:sz w:val="18"/>
-        </w:rPr>
+        <w:t xml:space="preserve">  -n couchquest scale deployment/session --replicas=2</w:t>
         <w:br/>
-        <w:t># Optional HPA after the manual scaling demonstration</w:t>
-      </w:r>
-      <w:r>
-        <w:rPr>
-          <w:rFonts w:ascii="Courier New" w:hAnsi="Courier New"/>
-          <w:sz w:val="18"/>
-        </w:rPr>
+        <w:t>minikube -p couchquest kubectl -- --context couchquest \</w:t>
+        <w:br/>
+        <w:t xml:space="preserve">  -n couchquest get pods</w:t>
         <w:br/>
         <w:t>minikube -p couchquest addons enable metrics-server</w:t>
-      </w:r>
-      <w:r>
-        <w:rPr>
-          <w:rFonts w:ascii="Courier New" w:hAnsi="Courier New"/>
-          <w:sz w:val="18"/>
-        </w:rPr>
-        <w:br/>
-        <w:t>kubectl apply -f deployment/hpa.yaml</w:t>
-      </w:r>
-      <w:r>
-        <w:rPr>
-          <w:rFonts w:ascii="Courier New" w:hAnsi="Courier New"/>
-          <w:sz w:val="18"/>
-        </w:rPr>
-        <w:br/>
-        <w:t>kubectl -n couchquest get hpa</w:t>
       </w:r>
     </w:p>
     <w:p>
@@ -4053,7 +3941,7 @@
     </w:p>
     <w:p>
       <w:r>
-        <w:t>Docker Compose configuration was parsed successfully. The Docker engine was unavailable and Minikube was not installed in the preparation environment. PostgreSQL-backed execution, Kubernetes deployment, dashboard observations and the demonstration video therefore still require an actual run. Do not describe the SQLite evidence as a cluster deployment.</w:t>
+        <w:t>Docker and Minikube deployment were executed on 30 October 2026. Each environment passed 11 real HTTP checks using separate PostgreSQL databases. All four Kubernetes deployments became available. Session scaled to two replicas and retained its completed session after a rolling API restart. Section 9 contains genuine deployment evidence.</w:t>
       </w:r>
     </w:p>
     <w:p>
@@ -4061,7 +3949,7 @@
         <w:pStyle w:val="Heading2"/>
       </w:pPr>
       <w:r>
-        <w:t>Screenshots to insert after your run</w:t>
+        <w:t>Evidence coverage</w:t>
       </w:r>
     </w:p>
     <w:tbl>
@@ -4127,15 +4015,8 @@
             <w:shd w:fill="E6ECF2"/>
           </w:tcPr>
           <w:p>
-            <w:pPr>
-              <w:spacing w:after="40" w:line="240" w:lineRule="auto"/>
-            </w:pPr>
             <w:r>
-              <w:rPr>
-                <w:b/>
-                <w:sz w:val="20"/>
-              </w:rPr>
-              <w:t>What the screenshot should show</w:t>
+              <w:t>Evidence provided or remaining</w:t>
             </w:r>
           </w:p>
         </w:tc>
@@ -4190,15 +4071,8 @@
             </w:tcMar>
           </w:tcPr>
           <w:p>
-            <w:pPr>
-              <w:spacing w:after="40" w:line="240" w:lineRule="auto"/>
-            </w:pPr>
             <w:r>
-              <w:rPr>
-                <w:b w:val="0"/>
-                <w:sz w:val="20"/>
-              </w:rPr>
-              <w:t>Game and session creation, HTTP 201, request and response body</w:t>
+              <w:t>HTTP transcript provided; Postman screenshot remaining</w:t>
             </w:r>
           </w:p>
         </w:tc>
@@ -4253,15 +4127,8 @@
             </w:tcMar>
           </w:tcPr>
           <w:p>
-            <w:pPr>
-              <w:spacing w:after="40" w:line="240" w:lineRule="auto"/>
-            </w:pPr>
             <w:r>
-              <w:rPr>
-                <w:b w:val="0"/>
-                <w:sz w:val="20"/>
-              </w:rPr>
-              <w:t>Third-player rejection with 409 and successful readiness/start/finish</w:t>
+              <w:t>Expected 409 and complete lifecycle verified in both deployments</w:t>
             </w:r>
           </w:p>
         </w:tc>
@@ -4316,15 +4183,8 @@
             </w:tcMar>
           </w:tcPr>
           <w:p>
-            <w:pPr>
-              <w:spacing w:after="40" w:line="240" w:lineRule="auto"/>
-            </w:pPr>
             <w:r>
-              <w:rPr>
-                <w:b w:val="0"/>
-                <w:sz w:val="20"/>
-              </w:rPr>
-              <w:t>Desired/available replicas, Ready pods and restart counts</w:t>
+              <w:t>Dashboard screenshot and resource listings provided</w:t>
             </w:r>
           </w:p>
         </w:tc>
@@ -4379,15 +4239,8 @@
             </w:tcMar>
           </w:tcPr>
           <w:p>
-            <w:pPr>
-              <w:spacing w:after="40" w:line="240" w:lineRule="auto"/>
-            </w:pPr>
             <w:r>
-              <w:rPr>
-                <w:b w:val="0"/>
-                <w:sz w:val="20"/>
-              </w:rPr>
-              <w:t>Internal service names, ports and Bound persistent volume claims</w:t>
+              <w:t>Four internal Services and two Bound PVCs recorded</w:t>
             </w:r>
           </w:p>
         </w:tc>
@@ -4442,15 +4295,8 @@
             </w:tcMar>
           </w:tcPr>
           <w:p>
-            <w:pPr>
-              <w:spacing w:after="40" w:line="240" w:lineRule="auto"/>
-            </w:pPr>
             <w:r>
-              <w:rPr>
-                <w:b w:val="0"/>
-                <w:sz w:val="20"/>
-              </w:rPr>
-              <w:t>Two Session pods; same session retrieved after API restart</w:t>
+              <w:t>Two Session pods and same session after restart verified</w:t>
             </w:r>
           </w:p>
         </w:tc>
@@ -4463,12 +4309,12 @@
     </w:p>
     <w:p>
       <w:r>
-        <w:t>[Insert your genuine Postman and Kubernetes dashboard screenshots here, with short captions describing the observed result. Add pages as needed.]</w:t>
+        <w:t>Deployment screenshot and analysis are included in Section 9. Full responses and resource listings are in evidence/deployment/. Postman application screenshots and the demonstration video remain to be recorded.</w:t>
       </w:r>
     </w:p>
     <w:p>
       <w:r>
-        <w:t>For persistence testing, retain a session ID, restart the Session API Deployment, wait for rollout and retrieve the same session. Restart a disconnected port-forward if needed. Do not delete database volumes or the namespace during this test.</w:t>
+        <w:t>Persistence was verified by retrieving the same completed session after restarting the Session Deployment. The result is saved in persistence-after-restart.json. API restart resilience does not establish database disaster recovery.</w:t>
       </w:r>
     </w:p>
     <w:p>
@@ -4503,7 +4349,7 @@
     </w:p>
     <w:p>
       <w:r>
-        <w:t>Catalog and Session are published as separate repositories, each with its own dependencies, tests, Dockerfile and CI workflow. The complete solution repository contains deployment files, documentation and a snapshot of both services.</w:t>
+        <w:t>Catalog and Session have separate repositories, each with its own dependencies, tests, Dockerfile, deployment files and CI workflow. The coordinating repository contains documentation, shared deployment configuration and pinned Git submodules.</w:t>
       </w:r>
     </w:p>
     <w:p>
@@ -4534,7 +4380,7 @@
     </w:p>
     <w:p>
       <w:r>
-        <w:t>Add student and group details, repository links, screenshots, observed dashboard analysis and the video. Review the code so that you can explain the service boundaries, remote call, version check and deployment configuration. Rename the report with your student ID and package the final submission as STUDENT_ID_CouchQuest.zip, replacing STUDENT_ID with your actual ID.</w:t>
+        <w:t>Add student and group details, Postman screenshots and the video. Deployment evidence is already included. Review the service boundaries, remote call, version check and deployment configuration. Rename the final submission STUDENT_ID_CouchQuest.zip using the actual student ID.</w:t>
       </w:r>
     </w:p>
     <w:p>
@@ -4581,6 +4427,147 @@
     <w:p>
       <w:r>
         <w:t>These official references support the deployment procedures. CouchQuest’s application design and fictional sample game are specific to this solution.</w:t>
+      </w:r>
+    </w:p>
+    <w:p>
+      <w:r>
+        <w:br w:type="page"/>
+      </w:r>
+    </w:p>
+    <w:p>
+      <w:pPr>
+        <w:pStyle w:val="Heading1"/>
+      </w:pPr>
+      <w:r>
+        <w:t>9 Executed deployment results</w:t>
+      </w:r>
+    </w:p>
+    <w:p>
+      <w:r>
+        <w:t>On 30 October 2026, CouchQuest ran in four separate Docker containers and on a local Minikube Kubernetes cluster. Each environment passed 11 HTTP checks, including expected business-rule rejections and the final COMPLETED state. Docker Engine 29.4.3, Minikube 1.39.0 and Kubernetes 1.35.0 were used; the local cluster had 2 CPUs and 2800 MB memory.</w:t>
+      </w:r>
+    </w:p>
+    <w:p>
+      <w:r>
+        <w:drawing>
+          <wp:inline xmlns:a="http://schemas.openxmlformats.org/drawingml/2006/main" xmlns:pic="http://schemas.openxmlformats.org/drawingml/2006/picture">
+            <wp:extent cx="5852160" cy="3367753"/>
+            <wp:docPr id="2" name="Picture 2"/>
+            <wp:cNvGraphicFramePr>
+              <a:graphicFrameLocks noChangeAspect="1"/>
+            </wp:cNvGraphicFramePr>
+            <a:graphic>
+              <a:graphicData uri="http://schemas.openxmlformats.org/drawingml/2006/picture">
+                <pic:pic>
+                  <pic:nvPicPr>
+                    <pic:cNvPr id="0" name="dashboard-deployments.png"/>
+                    <pic:cNvPicPr/>
+                  </pic:nvPicPr>
+                  <pic:blipFill>
+                    <a:blip r:embed="rId11"/>
+                    <a:stretch>
+                      <a:fillRect/>
+                    </a:stretch>
+                  </pic:blipFill>
+                  <pic:spPr>
+                    <a:xfrm>
+                      <a:off x="0" y="0"/>
+                      <a:ext cx="5852160" cy="3367753"/>
+                    </a:xfrm>
+                    <a:prstGeom prst="rect"/>
+                  </pic:spPr>
+                </pic:pic>
+              </a:graphicData>
+            </a:graphic>
+          </wp:inline>
+        </w:drawing>
+      </w:r>
+    </w:p>
+    <w:p>
+      <w:pPr>
+        <w:pStyle w:val="Caption"/>
+      </w:pPr>
+      <w:r>
+        <w:t>Figure 2  Actual Kubernetes dashboard for namespace couchquest</w:t>
+      </w:r>
+    </w:p>
+    <w:p>
+      <w:r>
+        <w:t>All four deployments are available: Catalog 1/1, Session 2/2 and each database 1/1. Session was scaled independently. Four ClusterIP Services expose the APIs internally on port 8000 and databases on 5432. Each database has its own Bound 1 GiB PVC. A completed session was retrieved successfully after a rolling Session API restart.</w:t>
+      </w:r>
+    </w:p>
+    <w:p>
+      <w:r>
+        <w:t>The initial API pods restarted twice while databases initialized. Readiness subsequently passed; replacement Session pods had zero restarts. The dashboard charts were still awaiting samples in this capture. Separate metrics-server readings are saved as a time-specific snapshot, not a performance benchmark. Automatic HPA scaling was not tested.</w:t>
+      </w:r>
+    </w:p>
+    <w:p>
+      <w:r>
+        <w:br w:type="page"/>
+      </w:r>
+    </w:p>
+    <w:p>
+      <w:pPr>
+        <w:pStyle w:val="Heading1"/>
+      </w:pPr>
+      <w:r>
+        <w:t>10 CI and CD execution</w:t>
+      </w:r>
+    </w:p>
+    <w:p>
+      <w:r>
+        <w:t>The implemented GitHub Actions pipeline tests the independently maintained services, builds their container images, creates a temporary Minikube cluster, deploys the application and databases, waits for rollouts, runs the complete HTTP scenario and uploads diagnostics. Cleanup removes only the temporary CI cluster. The local deployment is separate.</w:t>
+      </w:r>
+    </w:p>
+    <w:p>
+      <w:r>
+        <w:t>Successful run</w:t>
+        <w:br/>
+        <w:t>https://github.com/gchinar/CouchQuest/actions/runs/40999250344</w:t>
+      </w:r>
+    </w:p>
+    <w:p>
+      <w:r>
+        <w:t>The test-build-deploy job completed successfully: independent tests, image builds, Kubernetes deployment, HTTP checks and evidence upload all passed. Machine-readable run details are in evidence/deployment/ci-run.json. The workflow is .github/workflows/deploy.yml.</w:t>
+      </w:r>
+    </w:p>
+    <w:p>
+      <w:pPr>
+        <w:pStyle w:val="Heading2"/>
+      </w:pPr>
+      <w:r>
+        <w:t>Options considered</w:t>
+      </w:r>
+    </w:p>
+    <w:p>
+      <w:r>
+        <w:t>GitHub-hosted Minikube was selected because deployment can be repeated without long-lived cloud credentials. A self-hosted runner could deploy to a persistent local cluster but needs maintenance and isolation from untrusted changes. A registry and GitOps controller could promote immutable images to a persistent production cluster; that extension is not configured.</w:t>
+      </w:r>
+    </w:p>
+    <w:p>
+      <w:pPr>
+        <w:pStyle w:val="Heading2"/>
+      </w:pPr>
+      <w:r>
+        <w:t>Independent releases</w:t>
+      </w:r>
+    </w:p>
+    <w:p>
+      <w:r>
+        <w:t>Catalog and Session each retain their own CI and deployment manifests. The coordinating repository pins tested commits as submodules. Promoting a new service commit updates its pin; changes to deployment inputs or pins trigger the integration pipeline on main. Manual workflow execution is also available. This provides independent development and testing with an explicitly versioned integration deployment.</w:t>
+      </w:r>
+    </w:p>
+    <w:p>
+      <w:pPr>
+        <w:pStyle w:val="Heading2"/>
+      </w:pPr>
+      <w:r>
+        <w:t>Submission evidence</w:t>
+      </w:r>
+    </w:p>
+    <w:p>
+      <w:r>
+        <w:t>The evidence directory contains Docker container listings, Docker and Kubernetes HTTP transcripts, rollout and resource listings, the dashboard screenshot, scaling and persistence results, and the successful CI run. Personal student details, Postman application screenshots and the demonstration video still need to be added before submission.</w:t>
       </w:r>
     </w:p>
     <w:sectPr>

</xml_diff>